<commit_message>
Finalizacion de manual tecnico
</commit_message>
<xml_diff>
--- a/Documentaciones/Manual Técnico.docx
+++ b/Documentaciones/Manual Técnico.docx
@@ -2020,8 +2020,126 @@
         <w:t>Estas se interconectan entre si y están configuradas para complementarse en su funcionamiento.</w:t>
       </w:r>
     </w:p>
+    <w:p>
+      <w:pPr>
+        <w:jc w:val="both"/>
+        <w:rPr>
+          <w:rFonts w:ascii="Arial" w:hAnsi="Arial" w:cs="Arial"/>
+          <w:sz w:val="24"/>
+          <w:szCs w:val="24"/>
+        </w:rPr>
+      </w:pPr>
+    </w:p>
+    <w:p>
+      <w:pPr>
+        <w:jc w:val="both"/>
+        <w:rPr>
+          <w:rFonts w:ascii="Arial" w:hAnsi="Arial" w:cs="Arial"/>
+          <w:b/>
+          <w:bCs/>
+          <w:sz w:val="24"/>
+          <w:szCs w:val="24"/>
+        </w:rPr>
+      </w:pPr>
+      <w:r>
+        <w:rPr>
+          <w:rFonts w:ascii="Arial" w:hAnsi="Arial" w:cs="Arial"/>
+          <w:b/>
+          <w:bCs/>
+          <w:sz w:val="24"/>
+          <w:szCs w:val="24"/>
+        </w:rPr>
+        <w:t>Pruebas Unitarias</w:t>
+      </w:r>
+    </w:p>
+    <w:p>
+      <w:pPr>
+        <w:jc w:val="both"/>
+        <w:rPr>
+          <w:rFonts w:ascii="Arial" w:hAnsi="Arial" w:cs="Arial"/>
+          <w:sz w:val="24"/>
+          <w:szCs w:val="24"/>
+        </w:rPr>
+      </w:pPr>
+      <w:r>
+        <w:rPr>
+          <w:rFonts w:ascii="Arial" w:hAnsi="Arial" w:cs="Arial"/>
+          <w:sz w:val="24"/>
+          <w:szCs w:val="24"/>
+        </w:rPr>
+        <w:t xml:space="preserve">Se configuro el entorno Docker </w:t>
+      </w:r>
+      <w:r>
+        <w:rPr>
+          <w:rFonts w:ascii="Arial" w:hAnsi="Arial" w:cs="Arial"/>
+          <w:sz w:val="24"/>
+          <w:szCs w:val="24"/>
+        </w:rPr>
+        <w:t>dicri_mariorodriguez-backend_tests-run-bf950362ccba</w:t>
+      </w:r>
+      <w:r>
+        <w:rPr>
+          <w:rFonts w:ascii="Arial" w:hAnsi="Arial" w:cs="Arial"/>
+          <w:sz w:val="24"/>
+          <w:szCs w:val="24"/>
+        </w:rPr>
+        <w:t xml:space="preserve"> con la finalidad de poder ejecutar las pruebas unitarias de algunos servicios backend dando salidas similares a:</w:t>
+      </w:r>
+    </w:p>
+    <w:p>
+      <w:pPr>
+        <w:jc w:val="both"/>
+        <w:rPr>
+          <w:rFonts w:ascii="Arial" w:hAnsi="Arial" w:cs="Arial"/>
+          <w:sz w:val="24"/>
+          <w:szCs w:val="24"/>
+        </w:rPr>
+      </w:pPr>
+      <w:r>
+        <w:rPr>
+          <w:rFonts w:ascii="Arial" w:hAnsi="Arial" w:cs="Arial"/>
+          <w:sz w:val="24"/>
+          <w:szCs w:val="24"/>
+        </w:rPr>
+        <w:drawing>
+          <wp:inline distT="0" distB="0" distL="0" distR="0" wp14:anchorId="5C4E9ACF" wp14:editId="76F70C88">
+            <wp:extent cx="5612130" cy="1553845"/>
+            <wp:effectExtent l="0" t="0" r="7620" b="8255"/>
+            <wp:docPr id="13704802" name="Imagen 1" descr="Texto&#10;&#10;El contenido generado por IA puede ser incorrecto."/>
+            <wp:cNvGraphicFramePr>
+              <a:graphicFrameLocks xmlns:a="http://schemas.openxmlformats.org/drawingml/2006/main" noChangeAspect="1"/>
+            </wp:cNvGraphicFramePr>
+            <a:graphic xmlns:a="http://schemas.openxmlformats.org/drawingml/2006/main">
+              <a:graphicData uri="http://schemas.openxmlformats.org/drawingml/2006/picture">
+                <pic:pic xmlns:pic="http://schemas.openxmlformats.org/drawingml/2006/picture">
+                  <pic:nvPicPr>
+                    <pic:cNvPr id="13704802" name="Imagen 1" descr="Texto&#10;&#10;El contenido generado por IA puede ser incorrecto."/>
+                    <pic:cNvPicPr/>
+                  </pic:nvPicPr>
+                  <pic:blipFill>
+                    <a:blip r:embed="rId23"/>
+                    <a:stretch>
+                      <a:fillRect/>
+                    </a:stretch>
+                  </pic:blipFill>
+                  <pic:spPr>
+                    <a:xfrm>
+                      <a:off x="0" y="0"/>
+                      <a:ext cx="5612130" cy="1553845"/>
+                    </a:xfrm>
+                    <a:prstGeom prst="rect">
+                      <a:avLst/>
+                    </a:prstGeom>
+                  </pic:spPr>
+                </pic:pic>
+              </a:graphicData>
+            </a:graphic>
+          </wp:inline>
+        </w:drawing>
+      </w:r>
+    </w:p>
     <w:sectPr>
-      <w:headerReference w:type="default" r:id="rId23"/>
+      <w:headerReference w:type="default" r:id="rId24"/>
       <w:pgSz w:w="12240" w:h="15840"/>
       <w:pgMar w:top="1417" w:right="1701" w:bottom="1417" w:left="1701" w:header="708" w:footer="708" w:gutter="0"/>
       <w:cols w:space="708"/>
@@ -2565,7 +2683,6 @@
     <w:next w:val="Normal"/>
     <w:link w:val="Ttulo3Car"/>
     <w:uiPriority w:val="9"/>
-    <w:semiHidden/>
     <w:unhideWhenUsed/>
     <w:qFormat/>
     <w:rsid w:val="009A21C6"/>
@@ -2772,7 +2889,6 @@
     <w:basedOn w:val="Fuentedeprrafopredeter"/>
     <w:link w:val="Ttulo3"/>
     <w:uiPriority w:val="9"/>
-    <w:semiHidden/>
     <w:rsid w:val="009A21C6"/>
     <w:rPr>
       <w:rFonts w:eastAsiaTheme="majorEastAsia" w:cstheme="majorBidi"/>

</xml_diff>